<commit_message>
docs: add final delivery checklist and guardrail demo
</commit_message>
<xml_diff>
--- a/docs/report/E3-VDT-OOC-结课报告初稿.docx
+++ b/docs/report/E3-VDT-OOC-结课报告初稿.docx
@@ -3289,7 +3289,7 @@
         <w:rPr>
           <w:rFonts w:ascii="Calibri" w:hAnsi="Calibri" w:eastAsia="Microsoft YaHei"/>
         </w:rPr>
-        <w:t>网页端包含两个标签页：</w:t>
+        <w:t>网页端包含三个核心标签页：</w:t>
       </w:r>
     </w:p>
     <w:p>
@@ -3311,7 +3311,68 @@
         <w:rPr>
           <w:rFonts w:ascii="Calibri" w:hAnsi="Calibri" w:eastAsia="Microsoft YaHei"/>
         </w:rPr>
+        <w:t>分类不降验证：证明 sidecar 归因模块不会覆盖 VDT baseline 主分类；</w:t>
+      </w:r>
+    </w:p>
+    <w:p>
+      <w:pPr>
+        <w:pStyle w:val="ListNumber"/>
+      </w:pPr>
+      <w:r>
+        <w:rPr>
+          <w:rFonts w:ascii="Calibri" w:hAnsi="Calibri" w:eastAsia="Microsoft YaHei"/>
+        </w:rPr>
         <w:t>复现实验指标：展示 VDT baseline 复现状态和指标。</w:t>
+      </w:r>
+    </w:p>
+    <w:p>
+      <w:r>
+        <w:rPr>
+          <w:rFonts w:ascii="Calibri" w:hAnsi="Calibri" w:eastAsia="Microsoft YaHei"/>
+        </w:rPr>
+        <w:t xml:space="preserve">其中“分类不降验证”页会构造一个事件字段明显冲突的样例，同时输入 VDT baseline label。系统最终 </w:t>
+      </w:r>
+      <w:r>
+        <w:rPr>
+          <w:rFonts w:ascii="Consolas" w:hAnsi="Consolas" w:eastAsia="Microsoft YaHei"/>
+          <w:color w:val="1F4D78"/>
+          <w:sz w:val="20"/>
+        </w:rPr>
+        <w:t>label</w:t>
+      </w:r>
+      <w:r>
+        <w:rPr>
+          <w:rFonts w:ascii="Calibri" w:hAnsi="Calibri" w:eastAsia="Microsoft YaHei"/>
+        </w:rPr>
+        <w:t xml:space="preserve"> 严格继承 baseline，</w:t>
+      </w:r>
+      <w:r>
+        <w:rPr>
+          <w:rFonts w:ascii="Consolas" w:hAnsi="Consolas" w:eastAsia="Microsoft YaHei"/>
+          <w:color w:val="1F4D78"/>
+          <w:sz w:val="20"/>
+        </w:rPr>
+        <w:t>decision_source</w:t>
+      </w:r>
+      <w:r>
+        <w:rPr>
+          <w:rFonts w:ascii="Calibri" w:hAnsi="Calibri" w:eastAsia="Microsoft YaHei"/>
+        </w:rPr>
+        <w:t xml:space="preserve"> 标记为 </w:t>
+      </w:r>
+      <w:r>
+        <w:rPr>
+          <w:rFonts w:ascii="Consolas" w:hAnsi="Consolas" w:eastAsia="Microsoft YaHei"/>
+          <w:color w:val="1F4D78"/>
+          <w:sz w:val="20"/>
+        </w:rPr>
+        <w:t>vdt_baseline</w:t>
+      </w:r>
+      <w:r>
+        <w:rPr>
+          <w:rFonts w:ascii="Calibri" w:hAnsi="Calibri" w:eastAsia="Microsoft YaHei"/>
+        </w:rPr>
+        <w:t>，从界面层面证明 accuracy-preserving 口径。</w:t>
       </w:r>
     </w:p>
     <w:p>

</xml_diff>

<commit_message>
docs: finalize VDT reproduction metrics
</commit_message>
<xml_diff>
--- a/docs/report/E3-VDT-OOC-结课报告初稿.docx
+++ b/docs/report/E3-VDT-OOC-结课报告初稿.docx
@@ -95,7 +95,7 @@
         <w:rPr>
           <w:rFonts w:ascii="Calibri" w:hAnsi="Calibri" w:eastAsia="Microsoft YaHei"/>
         </w:rPr>
-        <w:t xml:space="preserve"> 设置下，当前复现得到 </w:t>
+        <w:t xml:space="preserve"> 设置下，复现得到 </w:t>
       </w:r>
       <w:r>
         <w:rPr>
@@ -132,6 +132,62 @@
           <w:sz w:val="20"/>
         </w:rPr>
         <w:t>AUC=0.7398</w:t>
+      </w:r>
+      <w:r>
+        <w:rPr>
+          <w:rFonts w:ascii="Calibri" w:hAnsi="Calibri" w:eastAsia="Microsoft YaHei"/>
+        </w:rPr>
+        <w:t xml:space="preserve">；在 </w:t>
+      </w:r>
+      <w:r>
+        <w:rPr>
+          <w:rFonts w:ascii="Consolas" w:hAnsi="Consolas" w:eastAsia="Microsoft YaHei"/>
+          <w:color w:val="1F4D78"/>
+          <w:sz w:val="20"/>
+        </w:rPr>
+        <w:t>target_domain=usa_today,washington_post</w:t>
+      </w:r>
+      <w:r>
+        <w:rPr>
+          <w:rFonts w:ascii="Calibri" w:hAnsi="Calibri" w:eastAsia="Microsoft YaHei"/>
+        </w:rPr>
+        <w:t xml:space="preserve"> 且 batch size 降为 64 的设置下，复现得到 </w:t>
+      </w:r>
+      <w:r>
+        <w:rPr>
+          <w:rFonts w:ascii="Consolas" w:hAnsi="Consolas" w:eastAsia="Microsoft YaHei"/>
+          <w:color w:val="1F4D78"/>
+          <w:sz w:val="20"/>
+        </w:rPr>
+        <w:t>F1=0.8032</w:t>
+      </w:r>
+      <w:r>
+        <w:rPr>
+          <w:rFonts w:ascii="Calibri" w:hAnsi="Calibri" w:eastAsia="Microsoft YaHei"/>
+        </w:rPr>
+        <w:t>、</w:t>
+      </w:r>
+      <w:r>
+        <w:rPr>
+          <w:rFonts w:ascii="Consolas" w:hAnsi="Consolas" w:eastAsia="Microsoft YaHei"/>
+          <w:color w:val="1F4D78"/>
+          <w:sz w:val="20"/>
+        </w:rPr>
+        <w:t>Acc=0.8032</w:t>
+      </w:r>
+      <w:r>
+        <w:rPr>
+          <w:rFonts w:ascii="Calibri" w:hAnsi="Calibri" w:eastAsia="Microsoft YaHei"/>
+        </w:rPr>
+        <w:t>、</w:t>
+      </w:r>
+      <w:r>
+        <w:rPr>
+          <w:rFonts w:ascii="Consolas" w:hAnsi="Consolas" w:eastAsia="Microsoft YaHei"/>
+          <w:color w:val="1F4D78"/>
+          <w:sz w:val="20"/>
+        </w:rPr>
+        <w:t>AUC=0.8028</w:t>
       </w:r>
       <w:r>
         <w:rPr>
@@ -2170,7 +2226,7 @@
                 <w:color w:val="000000"/>
                 <w:sz w:val="18"/>
               </w:rPr>
-              <w:t>running / partial</w:t>
+              <w:t>completed</w:t>
             </w:r>
           </w:p>
         </w:tc>
@@ -2196,7 +2252,7 @@
                 <w:color w:val="000000"/>
                 <w:sz w:val="18"/>
               </w:rPr>
-              <w:t>0.8013</w:t>
+              <w:t>0.8032</w:t>
             </w:r>
           </w:p>
         </w:tc>
@@ -2222,7 +2278,7 @@
                 <w:color w:val="000000"/>
                 <w:sz w:val="18"/>
               </w:rPr>
-              <w:t>0.8017</w:t>
+              <w:t>0.8032</w:t>
             </w:r>
           </w:p>
         </w:tc>
@@ -2248,7 +2304,7 @@
                 <w:color w:val="000000"/>
                 <w:sz w:val="18"/>
               </w:rPr>
-              <w:t>0.8006</w:t>
+              <w:t>0.8028</w:t>
             </w:r>
           </w:p>
         </w:tc>
@@ -2274,7 +2330,7 @@
                 <w:color w:val="000000"/>
                 <w:sz w:val="18"/>
               </w:rPr>
-              <w:t>当前已跑出 7 个 validation blocks，最终结果待训练结束确认</w:t>
+              <w:t>已完成 13 个 validation blocks，best-by-F1 来自第 9 个 validation block</w:t>
             </w:r>
           </w:p>
         </w:tc>
@@ -2286,7 +2342,21 @@
         <w:rPr>
           <w:rFonts w:ascii="Calibri" w:hAnsi="Calibri" w:eastAsia="Microsoft YaHei"/>
         </w:rPr>
-        <w:t>说明：第二组 bs64 当前为运行中结果，最终报告需以训练结束后的 best-by-F1 解析结果为准。</w:t>
+        <w:t xml:space="preserve">说明：两组 completed 结果均来自训练结束后 </w:t>
+      </w:r>
+      <w:r>
+        <w:rPr>
+          <w:rFonts w:ascii="Consolas" w:hAnsi="Consolas" w:eastAsia="Microsoft YaHei"/>
+          <w:color w:val="1F4D78"/>
+          <w:sz w:val="20"/>
+        </w:rPr>
+        <w:t>train_stdout.log</w:t>
+      </w:r>
+      <w:r>
+        <w:rPr>
+          <w:rFonts w:ascii="Calibri" w:hAnsi="Calibri" w:eastAsia="Microsoft YaHei"/>
+        </w:rPr>
+        <w:t xml:space="preserve"> 的 best-by-F1 解析；bs128 OOM 记录为本机硬件约束下的复现偏差。</w:t>
       </w:r>
     </w:p>
     <w:p>
@@ -3388,7 +3458,7 @@
         <w:rPr>
           <w:rFonts w:ascii="Calibri" w:hAnsi="Calibri" w:eastAsia="Microsoft YaHei"/>
         </w:rPr>
-        <w:t>当前 VDT baseline 已经在一组 domain 上完成严格流程复现，证明本项目不是仅做界面展示，而是完成了真实数据、特征预处理和模型训练。E3-VDT 的创新点主要体现在：</w:t>
+        <w:t>当前 VDT baseline 已经在两组 domain 设置上完成 strict BLIP-2/GaussianBlur 流程复现，证明本项目不是仅做界面展示，而是完成了真实数据、特征预处理和模型训练。E3-VDT 的创新点主要体现在：</w:t>
       </w:r>
     </w:p>
     <w:p>
@@ -3462,7 +3532,7 @@
         <w:rPr>
           <w:rFonts w:ascii="Calibri" w:hAnsi="Calibri" w:eastAsia="Microsoft YaHei"/>
         </w:rPr>
-        <w:t>第二组 domain 复现仍在运行，最终报告需补充完整指标；</w:t>
+        <w:t>受限于本机 GPU，复现实验没有覆盖论文全部 domain/超参数组合；</w:t>
       </w:r>
     </w:p>
     <w:p>

</xml_diff>